<commit_message>
Ignora entorno virtual y fija Python 3.11
</commit_message>
<xml_diff>
--- a/Nueva carpeta/CARTA NATAL ACTIVOS.docx
+++ b/Nueva carpeta/CARTA NATAL ACTIVOS.docx
@@ -1421,10 +1421,7 @@
         <w:t>13 de octubre de 1971</w:t>
       </w:r>
       <w:r>
-        <w:t xml:space="preserve"> (Fundación, </w:t>
-      </w:r>
-      <w:r>
-        <w:t>para empresas antiguas es mejor que IPO)</w:t>
+        <w:t xml:space="preserve"> (Fundación, para empresas antiguas es mejor que IPO)</w:t>
       </w:r>
     </w:p>
     <w:p>
@@ -1653,6 +1650,45 @@
           <w:color w:val="00B050"/>
         </w:rPr>
         <w:t>marca en qué fase de vida está el activo</w:t>
+      </w:r>
+    </w:p>
+    <w:p>
+      <w:pPr>
+        <w:spacing w:before="100" w:beforeAutospacing="1" w:after="100" w:afterAutospacing="1" w:line="240" w:lineRule="auto"/>
+        <w:jc w:val="center"/>
+        <w:rPr>
+          <w:rFonts w:eastAsia="Times New Roman" w:cstheme="minorHAnsi"/>
+          <w:b/>
+          <w:bCs/>
+          <w:sz w:val="44"/>
+          <w:szCs w:val="44"/>
+          <w:lang w:eastAsia="es-ES"/>
+        </w:rPr>
+      </w:pPr>
+    </w:p>
+    <w:p>
+      <w:pPr>
+        <w:spacing w:before="100" w:beforeAutospacing="1" w:after="100" w:afterAutospacing="1" w:line="240" w:lineRule="auto"/>
+        <w:jc w:val="center"/>
+        <w:rPr>
+          <w:rFonts w:eastAsia="Times New Roman" w:cstheme="minorHAnsi"/>
+          <w:b/>
+          <w:bCs/>
+          <w:sz w:val="44"/>
+          <w:szCs w:val="44"/>
+          <w:lang w:eastAsia="es-ES"/>
+        </w:rPr>
+      </w:pPr>
+      <w:r>
+        <w:rPr>
+          <w:rFonts w:eastAsia="Times New Roman" w:cstheme="minorHAnsi"/>
+          <w:b/>
+          <w:bCs/>
+          <w:sz w:val="44"/>
+          <w:szCs w:val="44"/>
+          <w:lang w:eastAsia="es-ES"/>
+        </w:rPr>
+        <w:t>MU</w:t>
       </w:r>
     </w:p>
     <w:p>

</xml_diff>